<commit_message>
Update CV, add SEO metadata, optimise photo, tidy bibliography
- CV: add 2026 working paper, fix title typos, rebuild publications
  with a hanging indent; export as cv_sep26.pdf and update link
- Add meta description, canonical URL, Open Graph/Twitter tags and
  Person JSON-LD
- Resize and strip metadata from profile photo (394 KB -> 52 KB);
  load it eagerly with explicit dimensions
- Fix favicon type and add apple-touch-icon
- Bibliography: consistent dashes, fix Jurča, full author names,
  "A and B" conjunction, et al. for long author lists

Co-Authored-By: Claude Opus 5.5 <noreply@anthropic.com>
</commit_message>
<xml_diff>
--- a/CV.docx
+++ b/CV.docx
@@ -1174,6 +1174,7 @@
           <w:tab w:val="left" w:pos="2410"/>
         </w:tabs>
         <w:spacing w:line="260" w:lineRule="exact"/>
+        <w:ind w:left="2410" w:hanging="2410"/>
         <w:rPr>
           <w:rFonts w:ascii="Times New Roman" w:hAnsi="Times New Roman" w:cs="Times New Roman"/>
           <w:sz w:val="22"/>
@@ -1199,151 +1200,8 @@
           <w:szCs w:val="22"/>
         </w:rPr>
         <w:tab/>
-      </w:r>
-      <w:r>
-        <w:rPr>
-          <w:rFonts w:ascii="Times New Roman" w:hAnsi="Times New Roman" w:cs="Times New Roman"/>
-          <w:sz w:val="22"/>
-          <w:szCs w:val="22"/>
-        </w:rPr>
-        <w:tab/>
-      </w:r>
-      <w:r>
-        <w:rPr>
-          <w:rFonts w:ascii="Times New Roman" w:hAnsi="Times New Roman" w:cs="Times New Roman"/>
-          <w:sz w:val="22"/>
-          <w:szCs w:val="22"/>
-        </w:rPr>
-        <w:t>“</w:t>
-      </w:r>
-      <w:r>
-        <w:rPr>
-          <w:rFonts w:ascii="Times New Roman" w:hAnsi="Times New Roman" w:cs="Times New Roman"/>
-          <w:sz w:val="22"/>
-          <w:szCs w:val="22"/>
-        </w:rPr>
-        <w:t xml:space="preserve">Simulating dynamic balance sheet reactions and macroprudential policy using the 2025 </w:t>
-      </w:r>
-      <w:r>
-        <w:rPr>
-          <w:rFonts w:ascii="Times New Roman" w:hAnsi="Times New Roman" w:cs="Times New Roman"/>
-          <w:sz w:val="22"/>
-          <w:szCs w:val="22"/>
-        </w:rPr>
-        <w:tab/>
-      </w:r>
-      <w:r>
-        <w:rPr>
-          <w:rFonts w:ascii="Times New Roman" w:hAnsi="Times New Roman" w:cs="Times New Roman"/>
-          <w:sz w:val="22"/>
-          <w:szCs w:val="22"/>
-        </w:rPr>
-        <w:tab/>
-      </w:r>
-      <w:r>
-        <w:rPr>
-          <w:rFonts w:ascii="Times New Roman" w:hAnsi="Times New Roman" w:cs="Times New Roman"/>
-          <w:sz w:val="22"/>
-          <w:szCs w:val="22"/>
-        </w:rPr>
-        <w:t>EU-wide stress test</w:t>
-      </w:r>
-      <w:r>
-        <w:rPr>
-          <w:rFonts w:ascii="Times New Roman" w:hAnsi="Times New Roman" w:cs="Times New Roman"/>
-          <w:sz w:val="22"/>
-          <w:szCs w:val="22"/>
-        </w:rPr>
-        <w:t xml:space="preserve">” (with </w:t>
-      </w:r>
-      <w:r>
-        <w:rPr>
-          <w:rFonts w:ascii="Times New Roman" w:hAnsi="Times New Roman" w:cs="Times New Roman"/>
-          <w:sz w:val="22"/>
-          <w:szCs w:val="22"/>
-        </w:rPr>
-        <w:t xml:space="preserve">Cyril Couaillier, Ivan Dimitrov, Finn Faber, Ieva </w:t>
-      </w:r>
-      <w:r>
-        <w:rPr>
-          <w:rFonts w:ascii="Times New Roman" w:hAnsi="Times New Roman" w:cs="Times New Roman"/>
-          <w:sz w:val="22"/>
-          <w:szCs w:val="22"/>
-        </w:rPr>
-        <w:br/>
-      </w:r>
-      <w:r>
-        <w:rPr>
-          <w:rFonts w:ascii="Times New Roman" w:hAnsi="Times New Roman" w:cs="Times New Roman"/>
-          <w:sz w:val="22"/>
-          <w:szCs w:val="22"/>
-        </w:rPr>
-        <w:tab/>
-      </w:r>
-      <w:r>
-        <w:rPr>
-          <w:rFonts w:ascii="Times New Roman" w:hAnsi="Times New Roman" w:cs="Times New Roman"/>
-          <w:sz w:val="22"/>
-          <w:szCs w:val="22"/>
-        </w:rPr>
-        <w:tab/>
-        <w:t>M</w:t>
-      </w:r>
-      <w:r>
-        <w:rPr>
-          <w:rFonts w:ascii="Times New Roman" w:hAnsi="Times New Roman" w:cs="Times New Roman"/>
-          <w:sz w:val="22"/>
-          <w:szCs w:val="22"/>
-        </w:rPr>
-        <w:t>ikaliūnaitė</w:t>
-      </w:r>
-      <w:r>
-        <w:rPr>
-          <w:rFonts w:ascii="Times New Roman" w:hAnsi="Times New Roman" w:cs="Times New Roman"/>
-          <w:sz w:val="22"/>
-          <w:szCs w:val="22"/>
-        </w:rPr>
-        <w:t>-</w:t>
-      </w:r>
-      <w:r>
-        <w:rPr>
-          <w:rFonts w:ascii="Times New Roman" w:hAnsi="Times New Roman" w:cs="Times New Roman"/>
-          <w:sz w:val="22"/>
-          <w:szCs w:val="22"/>
-        </w:rPr>
-        <w:t>Jouvanceau, André Nunes, Alessandro Pollastri and Nicola Röhm</w:t>
-      </w:r>
-      <w:r>
-        <w:rPr>
-          <w:rFonts w:ascii="Times New Roman" w:hAnsi="Times New Roman" w:cs="Times New Roman"/>
-          <w:sz w:val="22"/>
-          <w:szCs w:val="22"/>
-        </w:rPr>
-        <w:t>), 2025,</w:t>
-      </w:r>
-      <w:r>
-        <w:rPr>
-          <w:rFonts w:ascii="Times New Roman" w:hAnsi="Times New Roman" w:cs="Times New Roman"/>
-          <w:sz w:val="22"/>
-          <w:szCs w:val="22"/>
-        </w:rPr>
-        <w:tab/>
-      </w:r>
-      <w:r>
-        <w:rPr>
-          <w:rFonts w:ascii="Times New Roman" w:hAnsi="Times New Roman" w:cs="Times New Roman"/>
-          <w:sz w:val="22"/>
-          <w:szCs w:val="22"/>
-        </w:rPr>
-        <w:tab/>
-      </w:r>
-      <w:r>
-        <w:rPr>
-          <w:rFonts w:ascii="Times New Roman" w:hAnsi="Times New Roman" w:cs="Times New Roman"/>
-          <w:sz w:val="22"/>
-          <w:szCs w:val="22"/>
-        </w:rPr>
-        <w:t xml:space="preserve"> ECB Macroprudential Bulletin</w:t>
+        <w:tab/>
+        <w:t xml:space="preserve">“The impact of macroprudential policy fragmentation on corporate lending – evidence from a novel indicator” (with Markus Behn and Alessio Reghezza), 2026, ECB Working Paper Series</w:t>
       </w:r>
     </w:p>
     <w:p>
@@ -1354,86 +1212,22 @@
           <w:tab w:val="left" w:pos="2410"/>
         </w:tabs>
         <w:spacing w:line="260" w:lineRule="exact"/>
-        <w:rPr>
-          <w:rFonts w:ascii="Times New Roman" w:hAnsi="Times New Roman" w:cs="Times New Roman"/>
-          <w:sz w:val="22"/>
-          <w:szCs w:val="22"/>
-        </w:rPr>
-      </w:pPr>
-      <w:r>
-        <w:rPr>
-          <w:rFonts w:ascii="Times New Roman" w:hAnsi="Times New Roman" w:cs="Times New Roman"/>
-          <w:sz w:val="22"/>
-          <w:szCs w:val="22"/>
-        </w:rPr>
-        <w:tab/>
-      </w:r>
-      <w:r>
-        <w:rPr>
-          <w:rFonts w:ascii="Times New Roman" w:hAnsi="Times New Roman" w:cs="Times New Roman"/>
-          <w:sz w:val="22"/>
-          <w:szCs w:val="22"/>
-        </w:rPr>
-        <w:tab/>
-      </w:r>
-      <w:r>
-        <w:rPr>
-          <w:rFonts w:ascii="Times New Roman" w:hAnsi="Times New Roman" w:cs="Times New Roman"/>
-          <w:sz w:val="22"/>
-          <w:szCs w:val="22"/>
-        </w:rPr>
-        <w:t xml:space="preserve">“Residential real estate (RRE) lending standards: determinants and financial stability </w:t>
-      </w:r>
-      <w:r>
-        <w:rPr>
-          <w:rFonts w:ascii="Times New Roman" w:hAnsi="Times New Roman" w:cs="Times New Roman"/>
-          <w:sz w:val="22"/>
-          <w:szCs w:val="22"/>
-        </w:rPr>
-        <w:tab/>
-      </w:r>
-      <w:r>
-        <w:rPr>
-          <w:rFonts w:ascii="Times New Roman" w:hAnsi="Times New Roman" w:cs="Times New Roman"/>
-          <w:sz w:val="22"/>
-          <w:szCs w:val="22"/>
-        </w:rPr>
-        <w:tab/>
-        <w:t xml:space="preserve">implications” (with Giorgia De Nora, Elena Durante, Adele Fontana, Gregorio Ghetti, </w:t>
-      </w:r>
-      <w:r>
-        <w:rPr>
-          <w:rFonts w:ascii="Times New Roman" w:hAnsi="Times New Roman" w:cs="Times New Roman"/>
-          <w:sz w:val="22"/>
-          <w:szCs w:val="22"/>
-        </w:rPr>
-        <w:tab/>
-      </w:r>
-      <w:r>
-        <w:rPr>
-          <w:rFonts w:ascii="Times New Roman" w:hAnsi="Times New Roman" w:cs="Times New Roman"/>
-          <w:sz w:val="22"/>
-          <w:szCs w:val="22"/>
-        </w:rPr>
-        <w:tab/>
-        <w:t xml:space="preserve">Barbara Jarmulska, Cristian Perales, and Valerio Scalone), 2025, ECB Macroprudential </w:t>
-      </w:r>
-      <w:r>
-        <w:rPr>
-          <w:rFonts w:ascii="Times New Roman" w:hAnsi="Times New Roman" w:cs="Times New Roman"/>
-          <w:sz w:val="22"/>
-          <w:szCs w:val="22"/>
-        </w:rPr>
-        <w:tab/>
-      </w:r>
-      <w:r>
-        <w:rPr>
-          <w:rFonts w:ascii="Times New Roman" w:hAnsi="Times New Roman" w:cs="Times New Roman"/>
-          <w:sz w:val="22"/>
-          <w:szCs w:val="22"/>
-        </w:rPr>
-        <w:tab/>
-        <w:t>Bulletin</w:t>
+        <w:ind w:left="2410" w:hanging="2410"/>
+        <w:rPr>
+          <w:rFonts w:ascii="Times New Roman" w:hAnsi="Times New Roman" w:cs="Times New Roman"/>
+          <w:sz w:val="22"/>
+          <w:szCs w:val="22"/>
+        </w:rPr>
+      </w:pPr>
+      <w:r>
+        <w:rPr>
+          <w:rFonts w:ascii="Times New Roman" w:hAnsi="Times New Roman" w:cs="Times New Roman"/>
+          <w:sz w:val="22"/>
+          <w:szCs w:val="22"/>
+        </w:rPr>
+        <w:tab/>
+        <w:tab/>
+        <w:t xml:space="preserve">“Simulating dynamic balance sheet reactions and macroprudential policy using the 2025 EU-wide stress test” (with Cyril Couaillier, Ivan Dimitrov, Finn Faber, Ieva Mikaliūnaitė-Jouvanceau, André Nunes, Alessandro Pollastri and Nicola Röhm), 2025, ECB Macroprudential Bulletin</w:t>
       </w:r>
     </w:p>
     <w:p>
@@ -1444,108 +1238,22 @@
           <w:tab w:val="left" w:pos="2410"/>
         </w:tabs>
         <w:spacing w:line="260" w:lineRule="exact"/>
-        <w:rPr>
-          <w:rFonts w:ascii="Times New Roman" w:hAnsi="Times New Roman" w:cs="Times New Roman"/>
-          <w:sz w:val="22"/>
-          <w:szCs w:val="22"/>
-        </w:rPr>
-      </w:pPr>
-      <w:r>
-        <w:rPr>
-          <w:rFonts w:ascii="Times New Roman" w:hAnsi="Times New Roman" w:cs="Times New Roman"/>
-          <w:sz w:val="22"/>
-          <w:szCs w:val="22"/>
-        </w:rPr>
-        <w:tab/>
-      </w:r>
-      <w:r>
-        <w:rPr>
-          <w:rFonts w:ascii="Times New Roman" w:hAnsi="Times New Roman" w:cs="Times New Roman"/>
-          <w:sz w:val="22"/>
-          <w:szCs w:val="22"/>
-        </w:rPr>
-        <w:tab/>
-      </w:r>
-      <w:r>
-        <w:rPr>
-          <w:rFonts w:ascii="Times New Roman" w:hAnsi="Times New Roman" w:cs="Times New Roman"/>
-          <w:sz w:val="22"/>
-          <w:szCs w:val="22"/>
-        </w:rPr>
-        <w:t xml:space="preserve">“Buying insurance at low economic cost - The effects of bank capital buffer increases </w:t>
-      </w:r>
-      <w:r>
-        <w:rPr>
-          <w:rFonts w:ascii="Times New Roman" w:hAnsi="Times New Roman" w:cs="Times New Roman"/>
-          <w:sz w:val="22"/>
-          <w:szCs w:val="22"/>
-        </w:rPr>
-        <w:tab/>
-      </w:r>
-      <w:r>
-        <w:rPr>
-          <w:rFonts w:ascii="Times New Roman" w:hAnsi="Times New Roman" w:cs="Times New Roman"/>
-          <w:sz w:val="22"/>
-          <w:szCs w:val="22"/>
-        </w:rPr>
-        <w:tab/>
-        <w:t>since the pandemic” (with Markus Behn and Alessio Reghezza),</w:t>
-      </w:r>
-      <w:r>
-        <w:rPr>
-          <w:rFonts w:ascii="Times New Roman" w:hAnsi="Times New Roman" w:cs="Times New Roman"/>
-          <w:sz w:val="22"/>
-          <w:szCs w:val="22"/>
-        </w:rPr>
-        <w:t xml:space="preserve"> 2024, </w:t>
-      </w:r>
-      <w:r>
-        <w:rPr>
-          <w:rFonts w:ascii="Times New Roman" w:hAnsi="Times New Roman" w:cs="Times New Roman"/>
-          <w:sz w:val="22"/>
-          <w:szCs w:val="22"/>
-        </w:rPr>
-        <w:t>ECB</w:t>
-      </w:r>
-      <w:r>
-        <w:rPr>
-          <w:rFonts w:ascii="Times New Roman" w:hAnsi="Times New Roman" w:cs="Times New Roman"/>
-          <w:sz w:val="22"/>
-          <w:szCs w:val="22"/>
-        </w:rPr>
-        <w:t xml:space="preserve"> </w:t>
-      </w:r>
-      <w:r>
-        <w:rPr>
-          <w:rFonts w:ascii="Times New Roman" w:hAnsi="Times New Roman" w:cs="Times New Roman"/>
-          <w:sz w:val="22"/>
-          <w:szCs w:val="22"/>
-        </w:rPr>
-        <w:t xml:space="preserve">Working </w:t>
-      </w:r>
-      <w:r>
-        <w:rPr>
-          <w:rFonts w:ascii="Times New Roman" w:hAnsi="Times New Roman" w:cs="Times New Roman"/>
-          <w:sz w:val="22"/>
-          <w:szCs w:val="22"/>
-        </w:rPr>
-        <w:tab/>
-      </w:r>
-      <w:r>
-        <w:rPr>
-          <w:rFonts w:ascii="Times New Roman" w:hAnsi="Times New Roman" w:cs="Times New Roman"/>
-          <w:sz w:val="22"/>
-          <w:szCs w:val="22"/>
-        </w:rPr>
-        <w:tab/>
-      </w:r>
-      <w:r>
-        <w:rPr>
-          <w:rFonts w:ascii="Times New Roman" w:hAnsi="Times New Roman" w:cs="Times New Roman"/>
-          <w:sz w:val="22"/>
-          <w:szCs w:val="22"/>
-        </w:rPr>
-        <w:t>Paper Series</w:t>
+        <w:ind w:left="2410" w:hanging="2410"/>
+        <w:rPr>
+          <w:rFonts w:ascii="Times New Roman" w:hAnsi="Times New Roman" w:cs="Times New Roman"/>
+          <w:sz w:val="22"/>
+          <w:szCs w:val="22"/>
+        </w:rPr>
+      </w:pPr>
+      <w:r>
+        <w:rPr>
+          <w:rFonts w:ascii="Times New Roman" w:hAnsi="Times New Roman" w:cs="Times New Roman"/>
+          <w:sz w:val="22"/>
+          <w:szCs w:val="22"/>
+        </w:rPr>
+        <w:tab/>
+        <w:tab/>
+        <w:t xml:space="preserve">“Residential real estate (RRE) lending standards: determinants and financial stability implications” (with Giorgia De Nora, Elena Durante, Adele Fontana, Gregorio Ghetti, Barbara Jarmulska, Cristian Perales and Valerio Scalone), 2025, ECB Macroprudential Bulletin</w:t>
       </w:r>
     </w:p>
     <w:p>
@@ -1556,109 +1264,22 @@
           <w:tab w:val="left" w:pos="2410"/>
         </w:tabs>
         <w:spacing w:line="260" w:lineRule="exact"/>
-        <w:rPr>
-          <w:rFonts w:ascii="Times New Roman" w:hAnsi="Times New Roman" w:cs="Times New Roman"/>
-          <w:sz w:val="22"/>
-          <w:szCs w:val="22"/>
-        </w:rPr>
-      </w:pPr>
-      <w:r>
-        <w:rPr>
-          <w:rFonts w:ascii="Times New Roman" w:hAnsi="Times New Roman" w:cs="Times New Roman"/>
-          <w:sz w:val="22"/>
-          <w:szCs w:val="22"/>
-        </w:rPr>
-        <w:tab/>
-      </w:r>
-      <w:r>
-        <w:rPr>
-          <w:rFonts w:ascii="Times New Roman" w:hAnsi="Times New Roman" w:cs="Times New Roman"/>
-          <w:sz w:val="22"/>
-          <w:szCs w:val="22"/>
-        </w:rPr>
-        <w:tab/>
-      </w:r>
-      <w:r>
-        <w:rPr>
-          <w:rFonts w:ascii="Times New Roman" w:hAnsi="Times New Roman" w:cs="Times New Roman"/>
-          <w:sz w:val="22"/>
-          <w:szCs w:val="22"/>
-        </w:rPr>
-        <w:t xml:space="preserve">“The sectoral systemic risk buffer: general issues and application to residential real </w:t>
-      </w:r>
-      <w:r>
-        <w:rPr>
-          <w:rFonts w:ascii="Times New Roman" w:hAnsi="Times New Roman" w:cs="Times New Roman"/>
-          <w:sz w:val="22"/>
-          <w:szCs w:val="22"/>
-        </w:rPr>
-        <w:br/>
-      </w:r>
-      <w:r>
-        <w:rPr>
-          <w:rFonts w:ascii="Times New Roman" w:hAnsi="Times New Roman" w:cs="Times New Roman"/>
-          <w:sz w:val="22"/>
-          <w:szCs w:val="22"/>
-        </w:rPr>
-        <w:tab/>
-      </w:r>
-      <w:r>
-        <w:rPr>
-          <w:rFonts w:ascii="Times New Roman" w:hAnsi="Times New Roman" w:cs="Times New Roman"/>
-          <w:sz w:val="22"/>
-          <w:szCs w:val="22"/>
-        </w:rPr>
-        <w:tab/>
-        <w:t xml:space="preserve">estate-related risks” (with Markus Behn et al.), </w:t>
-      </w:r>
-      <w:r>
-        <w:rPr>
-          <w:rFonts w:ascii="Times New Roman" w:hAnsi="Times New Roman" w:cs="Times New Roman"/>
-          <w:sz w:val="22"/>
-          <w:szCs w:val="22"/>
-        </w:rPr>
-        <w:t xml:space="preserve">2024, </w:t>
-      </w:r>
-      <w:r>
-        <w:rPr>
-          <w:rFonts w:ascii="Times New Roman" w:hAnsi="Times New Roman" w:cs="Times New Roman"/>
-          <w:sz w:val="22"/>
-          <w:szCs w:val="22"/>
-        </w:rPr>
-        <w:t xml:space="preserve">ECB Occasional Paper </w:t>
-      </w:r>
-      <w:r>
-        <w:rPr>
-          <w:rFonts w:ascii="Times New Roman" w:hAnsi="Times New Roman" w:cs="Times New Roman"/>
-          <w:sz w:val="22"/>
-          <w:szCs w:val="22"/>
-        </w:rPr>
-        <w:tab/>
-      </w:r>
-      <w:r>
-        <w:rPr>
-          <w:rFonts w:ascii="Times New Roman" w:hAnsi="Times New Roman" w:cs="Times New Roman"/>
-          <w:sz w:val="22"/>
-          <w:szCs w:val="22"/>
-        </w:rPr>
-        <w:br/>
-      </w:r>
-      <w:r>
-        <w:rPr>
-          <w:rFonts w:ascii="Times New Roman" w:hAnsi="Times New Roman" w:cs="Times New Roman"/>
-          <w:sz w:val="22"/>
-          <w:szCs w:val="22"/>
-        </w:rPr>
-        <w:tab/>
-      </w:r>
-      <w:r>
-        <w:rPr>
-          <w:rFonts w:ascii="Times New Roman" w:hAnsi="Times New Roman" w:cs="Times New Roman"/>
-          <w:sz w:val="22"/>
-          <w:szCs w:val="22"/>
-        </w:rPr>
-        <w:tab/>
-        <w:t>Series</w:t>
+        <w:ind w:left="2410" w:hanging="2410"/>
+        <w:rPr>
+          <w:rFonts w:ascii="Times New Roman" w:hAnsi="Times New Roman" w:cs="Times New Roman"/>
+          <w:sz w:val="22"/>
+          <w:szCs w:val="22"/>
+        </w:rPr>
+      </w:pPr>
+      <w:r>
+        <w:rPr>
+          <w:rFonts w:ascii="Times New Roman" w:hAnsi="Times New Roman" w:cs="Times New Roman"/>
+          <w:sz w:val="22"/>
+          <w:szCs w:val="22"/>
+        </w:rPr>
+        <w:tab/>
+        <w:tab/>
+        <w:t xml:space="preserve">“Buying insurance at low economic cost – the effects of bank capital buffer increases since the pandemic” (with Markus Behn and Alessio Reghezza), 2024, ECB Working Paper Series</w:t>
       </w:r>
     </w:p>
     <w:p>
@@ -1669,85 +1290,22 @@
           <w:tab w:val="left" w:pos="2410"/>
         </w:tabs>
         <w:spacing w:line="260" w:lineRule="exact"/>
-        <w:rPr>
-          <w:rFonts w:ascii="Times New Roman" w:hAnsi="Times New Roman" w:cs="Times New Roman"/>
-          <w:sz w:val="22"/>
-          <w:szCs w:val="22"/>
-        </w:rPr>
-      </w:pPr>
-      <w:r>
-        <w:rPr>
-          <w:rFonts w:ascii="Times New Roman" w:hAnsi="Times New Roman" w:cs="Times New Roman"/>
-          <w:sz w:val="22"/>
-          <w:szCs w:val="22"/>
-        </w:rPr>
-        <w:tab/>
-      </w:r>
-      <w:r>
-        <w:rPr>
-          <w:rFonts w:ascii="Times New Roman" w:hAnsi="Times New Roman" w:cs="Times New Roman"/>
-          <w:sz w:val="22"/>
-          <w:szCs w:val="22"/>
-        </w:rPr>
-        <w:tab/>
-      </w:r>
-      <w:r>
-        <w:rPr>
-          <w:rFonts w:ascii="Times New Roman" w:hAnsi="Times New Roman" w:cs="Times New Roman"/>
-          <w:sz w:val="22"/>
-          <w:szCs w:val="22"/>
-        </w:rPr>
-        <w:t xml:space="preserve">“The effectiveness of borrower-based macroprudential policies: a cross-country analysis </w:t>
-      </w:r>
-      <w:r>
-        <w:rPr>
-          <w:rFonts w:ascii="Times New Roman" w:hAnsi="Times New Roman" w:cs="Times New Roman"/>
-          <w:sz w:val="22"/>
-          <w:szCs w:val="22"/>
-        </w:rPr>
-        <w:tab/>
-      </w:r>
-      <w:r>
-        <w:rPr>
-          <w:rFonts w:ascii="Times New Roman" w:hAnsi="Times New Roman" w:cs="Times New Roman"/>
-          <w:sz w:val="22"/>
-          <w:szCs w:val="22"/>
-        </w:rPr>
-        <w:tab/>
-        <w:t xml:space="preserve">using an integrated micro-macro simulation model (with Stelios Giannoulakis, Marco </w:t>
-      </w:r>
-      <w:r>
-        <w:rPr>
-          <w:rFonts w:ascii="Times New Roman" w:hAnsi="Times New Roman" w:cs="Times New Roman"/>
-          <w:sz w:val="22"/>
-          <w:szCs w:val="22"/>
-        </w:rPr>
-        <w:tab/>
-      </w:r>
-      <w:r>
-        <w:rPr>
-          <w:rFonts w:ascii="Times New Roman" w:hAnsi="Times New Roman" w:cs="Times New Roman"/>
-          <w:sz w:val="22"/>
-          <w:szCs w:val="22"/>
-        </w:rPr>
-        <w:tab/>
-        <w:t>Gross and Eugen Tereanu)”</w:t>
-      </w:r>
-      <w:r>
-        <w:rPr>
-          <w:rFonts w:ascii="Times New Roman" w:hAnsi="Times New Roman" w:cs="Times New Roman"/>
-          <w:sz w:val="22"/>
-          <w:szCs w:val="22"/>
-        </w:rPr>
-        <w:t>,</w:t>
-      </w:r>
-      <w:r>
-        <w:rPr>
-          <w:rFonts w:ascii="Times New Roman" w:hAnsi="Times New Roman" w:cs="Times New Roman"/>
-          <w:sz w:val="22"/>
-          <w:szCs w:val="22"/>
-        </w:rPr>
-        <w:t xml:space="preserve"> 2023, ECB Working Paper Series</w:t>
+        <w:ind w:left="2410" w:hanging="2410"/>
+        <w:rPr>
+          <w:rFonts w:ascii="Times New Roman" w:hAnsi="Times New Roman" w:cs="Times New Roman"/>
+          <w:sz w:val="22"/>
+          <w:szCs w:val="22"/>
+        </w:rPr>
+      </w:pPr>
+      <w:r>
+        <w:rPr>
+          <w:rFonts w:ascii="Times New Roman" w:hAnsi="Times New Roman" w:cs="Times New Roman"/>
+          <w:sz w:val="22"/>
+          <w:szCs w:val="22"/>
+        </w:rPr>
+        <w:tab/>
+        <w:tab/>
+        <w:t xml:space="preserve">“The sectoral systemic risk buffer: general issues and application to residential real estate-related risks” (with Markus Behn et al.), 2024, ECB Occasional Paper Series</w:t>
       </w:r>
     </w:p>
     <w:p>
@@ -1758,257 +1316,22 @@
           <w:tab w:val="left" w:pos="2410"/>
         </w:tabs>
         <w:spacing w:line="260" w:lineRule="exact"/>
-        <w:rPr>
-          <w:rFonts w:ascii="Times New Roman" w:hAnsi="Times New Roman" w:cs="Times New Roman"/>
-          <w:sz w:val="22"/>
-          <w:szCs w:val="22"/>
-        </w:rPr>
-      </w:pPr>
-      <w:r>
-        <w:rPr>
-          <w:rFonts w:ascii="Times New Roman" w:hAnsi="Times New Roman" w:cs="Times New Roman"/>
-          <w:sz w:val="22"/>
-          <w:szCs w:val="22"/>
-        </w:rPr>
-        <w:tab/>
-      </w:r>
-      <w:r>
-        <w:rPr>
-          <w:rFonts w:ascii="Times New Roman" w:hAnsi="Times New Roman" w:cs="Times New Roman"/>
-          <w:sz w:val="22"/>
-          <w:szCs w:val="22"/>
-        </w:rPr>
-        <w:tab/>
-        <w:t>“</w:t>
-      </w:r>
-      <w:r>
-        <w:rPr>
-          <w:rFonts w:ascii="Times New Roman" w:hAnsi="Times New Roman" w:cs="Times New Roman"/>
-          <w:sz w:val="22"/>
-          <w:szCs w:val="22"/>
-        </w:rPr>
-        <w:t>The effectiveness of borrower</w:t>
-      </w:r>
-      <w:r>
-        <w:rPr>
-          <w:rFonts w:ascii="Times New Roman" w:hAnsi="Times New Roman" w:cs="Times New Roman"/>
-          <w:sz w:val="22"/>
-          <w:szCs w:val="22"/>
-        </w:rPr>
-        <w:t>-</w:t>
-      </w:r>
-      <w:r>
-        <w:rPr>
-          <w:rFonts w:ascii="Times New Roman" w:hAnsi="Times New Roman" w:cs="Times New Roman"/>
-          <w:sz w:val="22"/>
-          <w:szCs w:val="22"/>
-        </w:rPr>
-        <w:t>based measures: a quantitative analysis for</w:t>
-      </w:r>
-      <w:r>
-        <w:rPr>
-          <w:rFonts w:ascii="Times New Roman" w:hAnsi="Times New Roman" w:cs="Times New Roman"/>
-          <w:sz w:val="22"/>
-          <w:szCs w:val="22"/>
-        </w:rPr>
-        <w:br/>
-      </w:r>
-      <w:r>
-        <w:rPr>
-          <w:rFonts w:ascii="Times New Roman" w:hAnsi="Times New Roman" w:cs="Times New Roman"/>
-          <w:sz w:val="22"/>
-          <w:szCs w:val="22"/>
-        </w:rPr>
-        <w:tab/>
-      </w:r>
-      <w:r>
-        <w:rPr>
-          <w:rFonts w:ascii="Times New Roman" w:hAnsi="Times New Roman" w:cs="Times New Roman"/>
-          <w:sz w:val="22"/>
-          <w:szCs w:val="22"/>
-        </w:rPr>
-        <w:tab/>
-      </w:r>
-      <w:r>
-        <w:rPr>
-          <w:rFonts w:ascii="Times New Roman" w:hAnsi="Times New Roman" w:cs="Times New Roman"/>
-          <w:sz w:val="22"/>
-          <w:szCs w:val="22"/>
-          <w:lang w:val="en-GB"/>
-        </w:rPr>
-        <w:t>S</w:t>
-      </w:r>
-      <w:r>
-        <w:rPr>
-          <w:rFonts w:ascii="Times New Roman" w:hAnsi="Times New Roman" w:cs="Times New Roman"/>
-          <w:sz w:val="22"/>
-          <w:szCs w:val="22"/>
-        </w:rPr>
-        <w:t>lovakia</w:t>
-      </w:r>
-      <w:r>
-        <w:rPr>
-          <w:rFonts w:ascii="Times New Roman" w:hAnsi="Times New Roman" w:cs="Times New Roman"/>
-          <w:sz w:val="22"/>
-          <w:szCs w:val="22"/>
-        </w:rPr>
-        <w:t>”</w:t>
-      </w:r>
-      <w:r>
-        <w:rPr>
-          <w:rFonts w:ascii="Times New Roman" w:hAnsi="Times New Roman" w:cs="Times New Roman"/>
-          <w:sz w:val="22"/>
-          <w:szCs w:val="22"/>
-        </w:rPr>
-        <w:t xml:space="preserve"> (with Pavol Jurča, Ján Klacso, Eugen Tereanu and Marco Gross), </w:t>
-      </w:r>
-      <w:r>
-        <w:rPr>
-          <w:rFonts w:ascii="Times New Roman" w:hAnsi="Times New Roman" w:cs="Times New Roman"/>
-          <w:sz w:val="22"/>
-          <w:szCs w:val="22"/>
-          <w:lang w:val="en-GB"/>
-        </w:rPr>
-        <w:t>2020</w:t>
-      </w:r>
-      <w:r>
-        <w:rPr>
-          <w:rFonts w:ascii="Times New Roman" w:hAnsi="Times New Roman" w:cs="Times New Roman"/>
-          <w:sz w:val="22"/>
-          <w:szCs w:val="22"/>
-        </w:rPr>
-        <w:t xml:space="preserve">, </w:t>
-      </w:r>
-      <w:r>
-        <w:rPr>
-          <w:rFonts w:ascii="Times New Roman" w:hAnsi="Times New Roman" w:cs="Times New Roman"/>
-          <w:sz w:val="22"/>
-          <w:szCs w:val="22"/>
-        </w:rPr>
-        <w:br/>
-      </w:r>
-      <w:r>
-        <w:rPr>
-          <w:rFonts w:ascii="Times New Roman" w:hAnsi="Times New Roman" w:cs="Times New Roman"/>
-          <w:sz w:val="22"/>
-          <w:szCs w:val="22"/>
-        </w:rPr>
-        <w:tab/>
-      </w:r>
-      <w:r>
-        <w:rPr>
-          <w:rFonts w:ascii="Times New Roman" w:hAnsi="Times New Roman" w:cs="Times New Roman"/>
-          <w:sz w:val="22"/>
-          <w:szCs w:val="22"/>
-        </w:rPr>
-        <w:tab/>
-        <w:t xml:space="preserve"> IMF WP series</w:t>
-      </w:r>
-      <w:r>
-        <w:rPr>
-          <w:rFonts w:ascii="Times New Roman" w:hAnsi="Times New Roman" w:cs="Times New Roman"/>
-          <w:sz w:val="22"/>
-          <w:szCs w:val="22"/>
-        </w:rPr>
-        <w:br/>
-      </w:r>
-      <w:r>
-        <w:rPr>
-          <w:rFonts w:ascii="Times New Roman" w:hAnsi="Times New Roman" w:cs="Times New Roman"/>
-          <w:sz w:val="22"/>
-          <w:szCs w:val="22"/>
-        </w:rPr>
-        <w:tab/>
-      </w:r>
-      <w:r>
-        <w:rPr>
-          <w:rFonts w:ascii="Times New Roman" w:hAnsi="Times New Roman" w:cs="Times New Roman"/>
-          <w:sz w:val="22"/>
-          <w:szCs w:val="22"/>
-        </w:rPr>
-        <w:tab/>
-      </w:r>
-      <w:r>
-        <w:rPr>
-          <w:rFonts w:ascii="Times New Roman" w:hAnsi="Times New Roman" w:cs="Times New Roman"/>
-          <w:sz w:val="22"/>
-          <w:szCs w:val="22"/>
-        </w:rPr>
-        <w:t>“</w:t>
-      </w:r>
-      <w:r>
-        <w:rPr>
-          <w:rFonts w:ascii="Times New Roman" w:hAnsi="Times New Roman" w:cs="Times New Roman"/>
-          <w:sz w:val="22"/>
-          <w:szCs w:val="22"/>
-        </w:rPr>
-        <w:t>Cyclical systemic risk and downside risks to bank profitability</w:t>
-      </w:r>
-      <w:r>
-        <w:rPr>
-          <w:rFonts w:ascii="Times New Roman" w:hAnsi="Times New Roman" w:cs="Times New Roman"/>
-          <w:sz w:val="22"/>
-          <w:szCs w:val="22"/>
-        </w:rPr>
-        <w:t>”</w:t>
-      </w:r>
-      <w:r>
-        <w:rPr>
-          <w:rFonts w:ascii="Times New Roman" w:hAnsi="Times New Roman" w:cs="Times New Roman"/>
-          <w:sz w:val="22"/>
-          <w:szCs w:val="22"/>
-        </w:rPr>
-        <w:t xml:space="preserve"> (with Jan Hannes </w:t>
-      </w:r>
-      <w:r>
-        <w:rPr>
-          <w:rFonts w:ascii="Times New Roman" w:hAnsi="Times New Roman" w:cs="Times New Roman"/>
-          <w:sz w:val="22"/>
-          <w:szCs w:val="22"/>
-        </w:rPr>
-        <w:br/>
-      </w:r>
-      <w:r>
-        <w:rPr>
-          <w:rFonts w:ascii="Times New Roman" w:hAnsi="Times New Roman" w:cs="Times New Roman"/>
-          <w:sz w:val="22"/>
-          <w:szCs w:val="22"/>
-        </w:rPr>
-        <w:tab/>
-      </w:r>
-      <w:r>
-        <w:rPr>
-          <w:rFonts w:ascii="Times New Roman" w:hAnsi="Times New Roman" w:cs="Times New Roman"/>
-          <w:sz w:val="22"/>
-          <w:szCs w:val="22"/>
-        </w:rPr>
-        <w:tab/>
-        <w:t xml:space="preserve">Lang), </w:t>
-      </w:r>
-      <w:r>
-        <w:rPr>
-          <w:rFonts w:ascii="Times New Roman" w:hAnsi="Times New Roman" w:cs="Times New Roman"/>
-          <w:sz w:val="22"/>
-          <w:szCs w:val="22"/>
-          <w:lang w:val="en-GB"/>
-        </w:rPr>
-        <w:t>2020</w:t>
-      </w:r>
-      <w:r>
-        <w:rPr>
-          <w:rFonts w:ascii="Times New Roman" w:hAnsi="Times New Roman" w:cs="Times New Roman"/>
-          <w:sz w:val="22"/>
-          <w:szCs w:val="22"/>
-        </w:rPr>
-        <w:t xml:space="preserve">, ECB </w:t>
-      </w:r>
-      <w:r>
-        <w:rPr>
-          <w:rFonts w:ascii="Times New Roman" w:hAnsi="Times New Roman" w:cs="Times New Roman"/>
-          <w:sz w:val="22"/>
-          <w:szCs w:val="22"/>
-        </w:rPr>
-        <w:t>Working Paper Series</w:t>
+        <w:ind w:left="2410" w:hanging="2410"/>
+        <w:rPr>
+          <w:rFonts w:ascii="Times New Roman" w:hAnsi="Times New Roman" w:cs="Times New Roman"/>
+          <w:sz w:val="22"/>
+          <w:szCs w:val="22"/>
+        </w:rPr>
+      </w:pPr>
+      <w:r>
+        <w:rPr>
+          <w:rFonts w:ascii="Times New Roman" w:hAnsi="Times New Roman" w:cs="Times New Roman"/>
+          <w:sz w:val="22"/>
+          <w:szCs w:val="22"/>
+        </w:rPr>
+        <w:tab/>
+        <w:tab/>
+        <w:t xml:space="preserve">“The effectiveness of borrower-based macroprudential policies: a cross-country analysis using an integrated micro-macro simulation model” (with Stelios Giannoulakis, Marco Gross and Eugen Tereanu), 2023, ECB Working Paper Series</w:t>
       </w:r>
     </w:p>
     <w:p>
@@ -2019,92 +1342,74 @@
           <w:tab w:val="left" w:pos="2410"/>
         </w:tabs>
         <w:spacing w:line="260" w:lineRule="exact"/>
-        <w:rPr>
-          <w:rFonts w:ascii="Times New Roman" w:hAnsi="Times New Roman" w:cs="Times New Roman"/>
-          <w:sz w:val="22"/>
-          <w:szCs w:val="22"/>
-        </w:rPr>
-      </w:pPr>
-      <w:r>
-        <w:rPr>
-          <w:rFonts w:ascii="Times New Roman" w:hAnsi="Times New Roman" w:cs="Times New Roman"/>
-          <w:sz w:val="22"/>
-          <w:szCs w:val="22"/>
-        </w:rPr>
-        <w:tab/>
-      </w:r>
-      <w:r>
-        <w:rPr>
-          <w:rFonts w:ascii="Times New Roman" w:hAnsi="Times New Roman" w:cs="Times New Roman"/>
-          <w:sz w:val="22"/>
-          <w:szCs w:val="22"/>
-        </w:rPr>
-        <w:tab/>
-      </w:r>
-      <w:r>
-        <w:rPr>
-          <w:rFonts w:ascii="Times New Roman" w:hAnsi="Times New Roman" w:cs="Times New Roman"/>
-          <w:sz w:val="22"/>
-          <w:szCs w:val="22"/>
-        </w:rPr>
-        <w:t>“</w:t>
-      </w:r>
-      <w:r>
-        <w:rPr>
-          <w:rFonts w:ascii="Times New Roman" w:hAnsi="Times New Roman" w:cs="Times New Roman"/>
-          <w:sz w:val="22"/>
-          <w:szCs w:val="22"/>
-        </w:rPr>
-        <w:t xml:space="preserve">Bank capital-at-risk: measuring the impact of cyclical systemic risk on future bank </w:t>
-      </w:r>
-      <w:r>
-        <w:rPr>
-          <w:rFonts w:ascii="Times New Roman" w:hAnsi="Times New Roman" w:cs="Times New Roman"/>
-          <w:sz w:val="22"/>
-          <w:szCs w:val="22"/>
-        </w:rPr>
-        <w:br/>
-      </w:r>
-      <w:r>
-        <w:rPr>
-          <w:rFonts w:ascii="Times New Roman" w:hAnsi="Times New Roman" w:cs="Times New Roman"/>
-          <w:sz w:val="22"/>
-          <w:szCs w:val="22"/>
-        </w:rPr>
-        <w:tab/>
-      </w:r>
-      <w:r>
-        <w:rPr>
-          <w:rFonts w:ascii="Times New Roman" w:hAnsi="Times New Roman" w:cs="Times New Roman"/>
-          <w:sz w:val="22"/>
-          <w:szCs w:val="22"/>
-        </w:rPr>
-        <w:tab/>
-        <w:t>losses</w:t>
-      </w:r>
-      <w:r>
-        <w:rPr>
-          <w:rFonts w:ascii="Times New Roman" w:hAnsi="Times New Roman" w:cs="Times New Roman"/>
-          <w:sz w:val="22"/>
-          <w:szCs w:val="22"/>
-        </w:rPr>
-        <w:t>”</w:t>
-      </w:r>
-      <w:r>
-        <w:rPr>
-          <w:rFonts w:ascii="Times New Roman" w:hAnsi="Times New Roman" w:cs="Times New Roman"/>
-          <w:sz w:val="22"/>
-          <w:szCs w:val="22"/>
-        </w:rPr>
-        <w:t xml:space="preserve"> (with Jan Hannes Lang), 2019, </w:t>
-      </w:r>
-      <w:r>
-        <w:rPr>
-          <w:rFonts w:ascii="Times New Roman" w:hAnsi="Times New Roman" w:cs="Times New Roman"/>
-          <w:sz w:val="22"/>
-          <w:szCs w:val="22"/>
-        </w:rPr>
-        <w:t>ECB Macroprudential Bulletin</w:t>
+        <w:ind w:left="2410" w:hanging="2410"/>
+        <w:rPr>
+          <w:rFonts w:ascii="Times New Roman" w:hAnsi="Times New Roman" w:cs="Times New Roman"/>
+          <w:sz w:val="22"/>
+          <w:szCs w:val="22"/>
+        </w:rPr>
+      </w:pPr>
+      <w:r>
+        <w:rPr>
+          <w:rFonts w:ascii="Times New Roman" w:hAnsi="Times New Roman" w:cs="Times New Roman"/>
+          <w:sz w:val="22"/>
+          <w:szCs w:val="22"/>
+        </w:rPr>
+        <w:tab/>
+        <w:tab/>
+        <w:t xml:space="preserve">“The effectiveness of borrower-based macroprudential measures: a quantitative analysis for Slovakia” (with Pavol Jurča, Ján Klacso, Eugen Tereanu and Marco Gross), 2020, IMF Working Paper Series</w:t>
+      </w:r>
+    </w:p>
+    <w:p>
+      <w:pPr>
+        <w:pStyle w:val="Body"/>
+        <w:tabs>
+          <w:tab w:val="right" w:pos="2268"/>
+          <w:tab w:val="left" w:pos="2410"/>
+        </w:tabs>
+        <w:spacing w:line="260" w:lineRule="exact"/>
+        <w:ind w:left="2410" w:hanging="2410"/>
+        <w:rPr>
+          <w:rFonts w:ascii="Times New Roman" w:hAnsi="Times New Roman" w:cs="Times New Roman"/>
+          <w:sz w:val="22"/>
+          <w:szCs w:val="22"/>
+        </w:rPr>
+      </w:pPr>
+      <w:r>
+        <w:rPr>
+          <w:rFonts w:ascii="Times New Roman" w:hAnsi="Times New Roman" w:cs="Times New Roman"/>
+          <w:sz w:val="22"/>
+          <w:szCs w:val="22"/>
+        </w:rPr>
+        <w:tab/>
+        <w:tab/>
+        <w:t xml:space="preserve">“Cyclical systemic risk and downside risks to bank profitability” (with Jan Hannes Lang), 2020, ECB Working Paper Series</w:t>
+      </w:r>
+    </w:p>
+    <w:p>
+      <w:pPr>
+        <w:pStyle w:val="Body"/>
+        <w:tabs>
+          <w:tab w:val="right" w:pos="2268"/>
+          <w:tab w:val="left" w:pos="2410"/>
+        </w:tabs>
+        <w:spacing w:line="260" w:lineRule="exact"/>
+        <w:ind w:left="2410" w:hanging="2410"/>
+        <w:rPr>
+          <w:rFonts w:ascii="Times New Roman" w:hAnsi="Times New Roman" w:cs="Times New Roman"/>
+          <w:sz w:val="22"/>
+          <w:szCs w:val="22"/>
+        </w:rPr>
+      </w:pPr>
+      <w:r>
+        <w:rPr>
+          <w:rFonts w:ascii="Times New Roman" w:hAnsi="Times New Roman" w:cs="Times New Roman"/>
+          <w:sz w:val="22"/>
+          <w:szCs w:val="22"/>
+        </w:rPr>
+        <w:tab/>
+        <w:tab/>
+        <w:t xml:space="preserve">“Bank capital-at-risk: measuring the impact of cyclical systemic risk on future bank losses” (with Jan Hannes Lang), 2019, ECB Macroprudential Bulletin</w:t>
       </w:r>
     </w:p>
     <w:p>

</xml_diff>